<commit_message>
Incorpora en el informe la evidencia de k6, ZAP, Trivy y npm audit.
</commit_message>
<xml_diff>
--- a/entrega/Informe_EP3_Atlas.docx
+++ b/entrega/Informe_EP3_Atlas.docx
@@ -792,7 +792,7 @@
           <w:b w:val="0"/>
           <w:sz w:val="22"/>
         </w:rPr>
-        <w:t>Fuera de esta ejecución: prueba formal con cinco adultos mayores, medición de disponibilidad 99,5 % mensual, correo de verificación y carga de 200 usuarios concurrentes. Esos puntos quedan como incidentes o trabajo pendiente, no como resultados aprobados.</w:t>
+        <w:t>Fuera de esta ejecución: prueba formal con cinco adultos mayores, medición de disponibilidad 99,5 % mensual, correo de verificación, SonarQube y TLS fuera de localhost. La carga de 200 usuarios sí se ejecutó: el resultado no cumple el p95 de 300 ms y queda como incidente, no como requisito aprobado.</w:t>
       </w:r>
     </w:p>
     <w:p>
@@ -1886,7 +1886,7 @@
           <w:b w:val="0"/>
           <w:sz w:val="22"/>
         </w:rPr>
-        <w:t>Enfoque mixto. La API se prueba con solicitudes HTTP repetibles. La pantalla se revisa para la confirmación de la baja y el recorrido cliente y luego contrato (NFR-USAB-4). La prioridad es autenticación y RBAC, después clientes y contratos, y al final la carga, que en esta corrida queda abierta.</w:t>
+        <w:t>Enfoque mixto. La API se prueba con solicitudes HTTP repetibles. La pantalla se revisa para la confirmación de la baja y el recorrido cliente y luego contrato (NFR-USAB-4). La prioridad es autenticación y RBAC, después clientes y contratos, y al final la carga de 200 usuarios, el análisis de dependencias y el escaneo de la pantalla.</w:t>
       </w:r>
     </w:p>
     <w:p>
@@ -2412,7 +2412,7 @@
                 <w:b w:val="0"/>
                 <w:sz w:val="18"/>
               </w:rPr>
-              <w:t>Cliente HTTP</w:t>
+              <w:t>Cliente HTTP y probar.ps1</w:t>
             </w:r>
           </w:p>
         </w:tc>
@@ -2429,6 +2429,142 @@
                 <w:sz w:val="18"/>
               </w:rPr>
               <w:t>Casos de login, RBAC, baja y documento</w:t>
+            </w:r>
+          </w:p>
+        </w:tc>
+      </w:tr>
+      <w:tr>
+        <w:tc>
+          <w:tcPr>
+            <w:tcW w:type="dxa" w:w="4873"/>
+          </w:tcPr>
+          <w:p>
+            <w:r/>
+            <w:r>
+              <w:rPr>
+                <w:rFonts w:ascii="Arial" w:hAnsi="Arial" w:eastAsia="Arial"/>
+                <w:b w:val="0"/>
+                <w:sz w:val="18"/>
+              </w:rPr>
+              <w:t>k6</w:t>
+            </w:r>
+          </w:p>
+        </w:tc>
+        <w:tc>
+          <w:tcPr>
+            <w:tcW w:type="dxa" w:w="4873"/>
+          </w:tcPr>
+          <w:p>
+            <w:r/>
+            <w:r>
+              <w:rPr>
+                <w:rFonts w:ascii="Arial" w:hAnsi="Arial" w:eastAsia="Arial"/>
+                <w:b w:val="0"/>
+                <w:sz w:val="18"/>
+              </w:rPr>
+              <w:t>200 usuarios sobre el listado de clientes</w:t>
+            </w:r>
+          </w:p>
+        </w:tc>
+      </w:tr>
+      <w:tr>
+        <w:tc>
+          <w:tcPr>
+            <w:tcW w:type="dxa" w:w="4873"/>
+          </w:tcPr>
+          <w:p>
+            <w:r/>
+            <w:r>
+              <w:rPr>
+                <w:rFonts w:ascii="Arial" w:hAnsi="Arial" w:eastAsia="Arial"/>
+                <w:b w:val="0"/>
+                <w:sz w:val="18"/>
+              </w:rPr>
+              <w:t>npm audit</w:t>
+            </w:r>
+          </w:p>
+        </w:tc>
+        <w:tc>
+          <w:tcPr>
+            <w:tcW w:type="dxa" w:w="4873"/>
+          </w:tcPr>
+          <w:p>
+            <w:r/>
+            <w:r>
+              <w:rPr>
+                <w:rFonts w:ascii="Arial" w:hAnsi="Arial" w:eastAsia="Arial"/>
+                <w:b w:val="0"/>
+                <w:sz w:val="18"/>
+              </w:rPr>
+              <w:t>Dependencias de la API dentro del contenedor</w:t>
+            </w:r>
+          </w:p>
+        </w:tc>
+      </w:tr>
+      <w:tr>
+        <w:tc>
+          <w:tcPr>
+            <w:tcW w:type="dxa" w:w="4873"/>
+          </w:tcPr>
+          <w:p>
+            <w:r/>
+            <w:r>
+              <w:rPr>
+                <w:rFonts w:ascii="Arial" w:hAnsi="Arial" w:eastAsia="Arial"/>
+                <w:b w:val="0"/>
+                <w:sz w:val="18"/>
+              </w:rPr>
+              <w:t>Trivy</w:t>
+            </w:r>
+          </w:p>
+        </w:tc>
+        <w:tc>
+          <w:tcPr>
+            <w:tcW w:type="dxa" w:w="4873"/>
+          </w:tcPr>
+          <w:p>
+            <w:r/>
+            <w:r>
+              <w:rPr>
+                <w:rFonts w:ascii="Arial" w:hAnsi="Arial" w:eastAsia="Arial"/>
+                <w:b w:val="0"/>
+                <w:sz w:val="18"/>
+              </w:rPr>
+              <w:t>Imagen atlas-api: sistema y paquetes Node</w:t>
+            </w:r>
+          </w:p>
+        </w:tc>
+      </w:tr>
+      <w:tr>
+        <w:tc>
+          <w:tcPr>
+            <w:tcW w:type="dxa" w:w="4873"/>
+          </w:tcPr>
+          <w:p>
+            <w:r/>
+            <w:r>
+              <w:rPr>
+                <w:rFonts w:ascii="Arial" w:hAnsi="Arial" w:eastAsia="Arial"/>
+                <w:b w:val="0"/>
+                <w:sz w:val="18"/>
+              </w:rPr>
+              <w:t>OWASP ZAP baseline</w:t>
+            </w:r>
+          </w:p>
+        </w:tc>
+        <w:tc>
+          <w:tcPr>
+            <w:tcW w:type="dxa" w:w="4873"/>
+          </w:tcPr>
+          <w:p>
+            <w:r/>
+            <w:r>
+              <w:rPr>
+                <w:rFonts w:ascii="Arial" w:hAnsi="Arial" w:eastAsia="Arial"/>
+                <w:b w:val="0"/>
+                <w:sz w:val="18"/>
+              </w:rPr>
+              <w:t>Pantalla en http://localhost:8080</w:t>
             </w:r>
           </w:p>
         </w:tc>
@@ -3625,7 +3761,7 @@
                 <w:b w:val="0"/>
                 <w:sz w:val="18"/>
               </w:rPr>
-              <w:t>Listado con 200 usuarios y p95 menor a 300 ms</w:t>
+              <w:t>Listado con 200 usuarios durante 20 s y p95 menor a 300 ms</w:t>
             </w:r>
           </w:p>
         </w:tc>
@@ -3659,7 +3795,7 @@
                 <w:b w:val="0"/>
                 <w:sz w:val="18"/>
               </w:rPr>
-              <w:t>No ejecutado en esta corrida</w:t>
+              <w:t>0 % de error y p95 de 1,28 s. No cumple el tiempo</w:t>
             </w:r>
           </w:p>
         </w:tc>
@@ -4160,7 +4296,7 @@
                 <w:b w:val="0"/>
                 <w:sz w:val="18"/>
               </w:rPr>
-              <w:t>Umbral del ERS, pendiente</w:t>
+              <w:t>Ejecutado: p95 1,28 s, no cumple 300 ms</w:t>
             </w:r>
           </w:p>
         </w:tc>
@@ -4644,7 +4780,7 @@
                 <w:b w:val="0"/>
                 <w:sz w:val="18"/>
               </w:rPr>
-              <w:t>No ejecutado</w:t>
+              <w:t>Ejecutado. 0 % de error. p95 1,28 s. No cumple</w:t>
             </w:r>
           </w:p>
         </w:tc>
@@ -4742,7 +4878,7 @@
           <w:b w:val="0"/>
           <w:sz w:val="22"/>
         </w:rPr>
-        <w:t>Se revisó el código de codigo/atlas/api/src/index.js y el esquema SQL. No se ejecutó SonarQube ni npm audit en esta corrida. La revisión manual buscó los controles que el ERS exige en el backend.</w:t>
+        <w:t>Se revisó el código de codigo/atlas/api/src/index.js y el esquema SQL. Sobre esa lectura se ejecutaron npm audit dentro del contenedor de la API y Trivy sobre la imagen atlas-api. SonarQube no está instalado en este equipo y no se declara como resultado. OWASP ZAP se corrió contra la pantalla encendida y se informa en la sección 6, porque es una prueba dinámica.</w:t>
       </w:r>
     </w:p>
     <w:p>
@@ -5139,7 +5275,7 @@
                 <w:b w:val="0"/>
                 <w:sz w:val="18"/>
               </w:rPr>
-              <w:t>No hay escaneo de dependencias npm en la evidencia</w:t>
+              <w:t>npm audit: 7 hallazgos (3 altos, 1 moderado, 3 bajos) en Express 4.19.2 y dependencias</w:t>
             </w:r>
           </w:p>
         </w:tc>
@@ -5171,7 +5307,73 @@
                 <w:b w:val="0"/>
                 <w:sz w:val="18"/>
               </w:rPr>
-              <w:t>Pendiente</w:t>
+              <w:t>Abierto, INC-05</w:t>
+            </w:r>
+          </w:p>
+        </w:tc>
+      </w:tr>
+      <w:tr>
+        <w:tc>
+          <w:tcPr>
+            <w:tcW w:type="dxa" w:w="2436"/>
+          </w:tcPr>
+          <w:p>
+            <w:r/>
+            <w:r>
+              <w:rPr>
+                <w:rFonts w:ascii="Arial" w:hAnsi="Arial" w:eastAsia="Arial"/>
+                <w:b w:val="0"/>
+                <w:sz w:val="18"/>
+              </w:rPr>
+              <w:t>AST-06</w:t>
+            </w:r>
+          </w:p>
+        </w:tc>
+        <w:tc>
+          <w:tcPr>
+            <w:tcW w:type="dxa" w:w="2436"/>
+          </w:tcPr>
+          <w:p>
+            <w:r/>
+            <w:r>
+              <w:rPr>
+                <w:rFonts w:ascii="Arial" w:hAnsi="Arial" w:eastAsia="Arial"/>
+                <w:b w:val="0"/>
+                <w:sz w:val="18"/>
+              </w:rPr>
+              <w:t>Trivy: Alpine 1 media (zlib). Paquetes Node de la imagen: 25 altos, 11 medios, 0 críticos</w:t>
+            </w:r>
+          </w:p>
+        </w:tc>
+        <w:tc>
+          <w:tcPr>
+            <w:tcW w:type="dxa" w:w="2436"/>
+          </w:tcPr>
+          <w:p>
+            <w:r/>
+            <w:r>
+              <w:rPr>
+                <w:rFonts w:ascii="Arial" w:hAnsi="Arial" w:eastAsia="Arial"/>
+                <w:b w:val="0"/>
+                <w:sz w:val="18"/>
+              </w:rPr>
+              <w:t>Ley 21.663</w:t>
+            </w:r>
+          </w:p>
+        </w:tc>
+        <w:tc>
+          <w:tcPr>
+            <w:tcW w:type="dxa" w:w="2436"/>
+          </w:tcPr>
+          <w:p>
+            <w:r/>
+            <w:r>
+              <w:rPr>
+                <w:rFonts w:ascii="Arial" w:hAnsi="Arial" w:eastAsia="Arial"/>
+                <w:b w:val="0"/>
+                <w:sz w:val="18"/>
+              </w:rPr>
+              <w:t>Abierto, INC-05</w:t>
             </w:r>
           </w:p>
         </w:tc>
@@ -5204,7 +5406,7 @@
           <w:b w:val="0"/>
           <w:sz w:val="22"/>
         </w:rPr>
-        <w:t>El 403 del editor no se dedujo solo del código: la solicitud HTTP lo confirmó. La baja lógica del código coincide con el 404 posterior y con la fila de auditoría.</w:t>
+        <w:t>El 403 del editor no se dedujo solo del código: la solicitud HTTP lo confirmó. La baja lógica del código coincide con el 404 posterior y con la fila de auditoría. npm audit y Trivy leen dependencias e imagen; ZAP observa la pantalla ya publicada. Son herramientas distintas y no se sustituyen entre sí.</w:t>
       </w:r>
     </w:p>
     <w:p>
@@ -5348,7 +5550,7 @@
                 <w:b w:val="0"/>
                 <w:sz w:val="18"/>
               </w:rPr>
-              <w:t>4, más logout y auditoría</w:t>
+              <w:t>5, más logout, auditoría, npm audit, Trivy y ZAP</w:t>
             </w:r>
           </w:p>
         </w:tc>
@@ -5400,7 +5602,7 @@
                 <w:b w:val="0"/>
                 <w:sz w:val="18"/>
               </w:rPr>
-              <w:t>No ejecutados</w:t>
+              <w:t>Ejecutado y no aprobado</w:t>
             </w:r>
           </w:p>
         </w:tc>
@@ -5416,7 +5618,7 @@
                 <w:b w:val="0"/>
                 <w:sz w:val="18"/>
               </w:rPr>
-              <w:t>CP-PERF-01</w:t>
+              <w:t>CP-PERF-01: p95 1,28 s</w:t>
             </w:r>
           </w:p>
         </w:tc>
@@ -5852,7 +6054,7 @@
                 <w:b w:val="0"/>
                 <w:sz w:val="18"/>
               </w:rPr>
-              <w:t>No ejecutado</w:t>
+              <w:t>4428 peticiones, 0 % de error, p95 1,28 s</w:t>
             </w:r>
           </w:p>
         </w:tc>
@@ -5868,7 +6070,157 @@
                 <w:b w:val="0"/>
                 <w:sz w:val="18"/>
               </w:rPr>
-              <w:t>INC-02</w:t>
+              <w:t>Figura 6, INC-02</w:t>
+            </w:r>
+          </w:p>
+        </w:tc>
+      </w:tr>
+      <w:tr>
+        <w:tc>
+          <w:tcPr>
+            <w:tcW w:type="dxa" w:w="3249"/>
+          </w:tcPr>
+          <w:p>
+            <w:r/>
+            <w:r>
+              <w:rPr>
+                <w:rFonts w:ascii="Arial" w:hAnsi="Arial" w:eastAsia="Arial"/>
+                <w:b w:val="0"/>
+                <w:sz w:val="18"/>
+              </w:rPr>
+              <w:t>npm audit</w:t>
+            </w:r>
+          </w:p>
+        </w:tc>
+        <w:tc>
+          <w:tcPr>
+            <w:tcW w:type="dxa" w:w="3249"/>
+          </w:tcPr>
+          <w:p>
+            <w:r/>
+            <w:r>
+              <w:rPr>
+                <w:rFonts w:ascii="Arial" w:hAnsi="Arial" w:eastAsia="Arial"/>
+                <w:b w:val="0"/>
+                <w:sz w:val="18"/>
+              </w:rPr>
+              <w:t>7 hallazgos, 3 altos</w:t>
+            </w:r>
+          </w:p>
+        </w:tc>
+        <w:tc>
+          <w:tcPr>
+            <w:tcW w:type="dxa" w:w="3249"/>
+          </w:tcPr>
+          <w:p>
+            <w:r/>
+            <w:r>
+              <w:rPr>
+                <w:rFonts w:ascii="Arial" w:hAnsi="Arial" w:eastAsia="Arial"/>
+                <w:b w:val="0"/>
+                <w:sz w:val="18"/>
+              </w:rPr>
+              <w:t>Figura 7, INC-05</w:t>
+            </w:r>
+          </w:p>
+        </w:tc>
+      </w:tr>
+      <w:tr>
+        <w:tc>
+          <w:tcPr>
+            <w:tcW w:type="dxa" w:w="3249"/>
+          </w:tcPr>
+          <w:p>
+            <w:r/>
+            <w:r>
+              <w:rPr>
+                <w:rFonts w:ascii="Arial" w:hAnsi="Arial" w:eastAsia="Arial"/>
+                <w:b w:val="0"/>
+                <w:sz w:val="18"/>
+              </w:rPr>
+              <w:t>Trivy</w:t>
+            </w:r>
+          </w:p>
+        </w:tc>
+        <w:tc>
+          <w:tcPr>
+            <w:tcW w:type="dxa" w:w="3249"/>
+          </w:tcPr>
+          <w:p>
+            <w:r/>
+            <w:r>
+              <w:rPr>
+                <w:rFonts w:ascii="Arial" w:hAnsi="Arial" w:eastAsia="Arial"/>
+                <w:b w:val="0"/>
+                <w:sz w:val="18"/>
+              </w:rPr>
+              <w:t>0 críticas en Alpine; 25 altos en paquetes Node</w:t>
+            </w:r>
+          </w:p>
+        </w:tc>
+        <w:tc>
+          <w:tcPr>
+            <w:tcW w:type="dxa" w:w="3249"/>
+          </w:tcPr>
+          <w:p>
+            <w:r/>
+            <w:r>
+              <w:rPr>
+                <w:rFonts w:ascii="Arial" w:hAnsi="Arial" w:eastAsia="Arial"/>
+                <w:b w:val="0"/>
+                <w:sz w:val="18"/>
+              </w:rPr>
+              <w:t>Figura 8, INC-05</w:t>
+            </w:r>
+          </w:p>
+        </w:tc>
+      </w:tr>
+      <w:tr>
+        <w:tc>
+          <w:tcPr>
+            <w:tcW w:type="dxa" w:w="3249"/>
+          </w:tcPr>
+          <w:p>
+            <w:r/>
+            <w:r>
+              <w:rPr>
+                <w:rFonts w:ascii="Arial" w:hAnsi="Arial" w:eastAsia="Arial"/>
+                <w:b w:val="0"/>
+                <w:sz w:val="18"/>
+              </w:rPr>
+              <w:t>ZAP baseline</w:t>
+            </w:r>
+          </w:p>
+        </w:tc>
+        <w:tc>
+          <w:tcPr>
+            <w:tcW w:type="dxa" w:w="3249"/>
+          </w:tcPr>
+          <w:p>
+            <w:r/>
+            <w:r>
+              <w:rPr>
+                <w:rFonts w:ascii="Arial" w:hAnsi="Arial" w:eastAsia="Arial"/>
+                <w:b w:val="0"/>
+                <w:sz w:val="18"/>
+              </w:rPr>
+              <w:t>0 fallos nuevos, 8 avisos, 59 en orden</w:t>
+            </w:r>
+          </w:p>
+        </w:tc>
+        <w:tc>
+          <w:tcPr>
+            <w:tcW w:type="dxa" w:w="3249"/>
+          </w:tcPr>
+          <w:p>
+            <w:r/>
+            <w:r>
+              <w:rPr>
+                <w:rFonts w:ascii="Arial" w:hAnsi="Arial" w:eastAsia="Arial"/>
+                <w:b w:val="0"/>
+                <w:sz w:val="18"/>
+              </w:rPr>
+              <w:t>Figura 9, INC-06</w:t>
             </w:r>
           </w:p>
         </w:tc>
@@ -5879,7 +6231,7 @@
       <w:r>
         <w:drawing>
           <wp:inline xmlns:a="http://schemas.openxmlformats.org/drawingml/2006/main" xmlns:pic="http://schemas.openxmlformats.org/drawingml/2006/picture">
-            <wp:extent cx="5580000" cy="2130545"/>
+            <wp:extent cx="5580000" cy="3676428"/>
             <wp:docPr id="1" name="Picture 1"/>
             <wp:cNvGraphicFramePr>
               <a:graphicFrameLocks noChangeAspect="1"/>
@@ -5888,7 +6240,7 @@
               <a:graphicData uri="http://schemas.openxmlformats.org/drawingml/2006/picture">
                 <pic:pic>
                   <pic:nvPicPr>
-                    <pic:cNvPr id="0" name="fig1-login.png"/>
+                    <pic:cNvPr id="0" name="01_login.png"/>
                     <pic:cNvPicPr/>
                   </pic:nvPicPr>
                   <pic:blipFill>
@@ -5900,7 +6252,7 @@
                   <pic:spPr>
                     <a:xfrm>
                       <a:off x="0" y="0"/>
-                      <a:ext cx="5580000" cy="2130545"/>
+                      <a:ext cx="5580000" cy="3676428"/>
                     </a:xfrm>
                     <a:prstGeom prst="rect"/>
                   </pic:spPr>
@@ -5930,7 +6282,7 @@
       <w:r>
         <w:drawing>
           <wp:inline xmlns:a="http://schemas.openxmlformats.org/drawingml/2006/main" xmlns:pic="http://schemas.openxmlformats.org/drawingml/2006/picture">
-            <wp:extent cx="5580000" cy="2130545"/>
+            <wp:extent cx="5580000" cy="3676428"/>
             <wp:docPr id="2" name="Picture 2"/>
             <wp:cNvGraphicFramePr>
               <a:graphicFrameLocks noChangeAspect="1"/>
@@ -5939,7 +6291,7 @@
               <a:graphicData uri="http://schemas.openxmlformats.org/drawingml/2006/picture">
                 <pic:pic>
                   <pic:nvPicPr>
-                    <pic:cNvPr id="0" name="fig2-rbac.png"/>
+                    <pic:cNvPr id="0" name="12_api_editor_post_403.png"/>
                     <pic:cNvPicPr/>
                   </pic:nvPicPr>
                   <pic:blipFill>
@@ -5951,7 +6303,7 @@
                   <pic:spPr>
                     <a:xfrm>
                       <a:off x="0" y="0"/>
-                      <a:ext cx="5580000" cy="2130545"/>
+                      <a:ext cx="5580000" cy="3676428"/>
                     </a:xfrm>
                     <a:prstGeom prst="rect"/>
                   </pic:spPr>
@@ -5981,7 +6333,7 @@
       <w:r>
         <w:drawing>
           <wp:inline xmlns:a="http://schemas.openxmlformats.org/drawingml/2006/main" xmlns:pic="http://schemas.openxmlformats.org/drawingml/2006/picture">
-            <wp:extent cx="5580000" cy="2130545"/>
+            <wp:extent cx="5580000" cy="4546515"/>
             <wp:docPr id="3" name="Picture 3"/>
             <wp:cNvGraphicFramePr>
               <a:graphicFrameLocks noChangeAspect="1"/>
@@ -5990,7 +6342,7 @@
               <a:graphicData uri="http://schemas.openxmlformats.org/drawingml/2006/picture">
                 <pic:pic>
                   <pic:nvPicPr>
-                    <pic:cNvPr id="0" name="fig3-baja.png"/>
+                    <pic:cNvPr id="0" name="03_confirmacion_baja.png"/>
                     <pic:cNvPicPr/>
                   </pic:nvPicPr>
                   <pic:blipFill>
@@ -6002,7 +6354,7 @@
                   <pic:spPr>
                     <a:xfrm>
                       <a:off x="0" y="0"/>
-                      <a:ext cx="5580000" cy="2130545"/>
+                      <a:ext cx="5580000" cy="4546515"/>
                     </a:xfrm>
                     <a:prstGeom prst="rect"/>
                   </pic:spPr>
@@ -6032,7 +6384,7 @@
       <w:r>
         <w:drawing>
           <wp:inline xmlns:a="http://schemas.openxmlformats.org/drawingml/2006/main" xmlns:pic="http://schemas.openxmlformats.org/drawingml/2006/picture">
-            <wp:extent cx="5580000" cy="2130545"/>
+            <wp:extent cx="5580000" cy="3676428"/>
             <wp:docPr id="4" name="Picture 4"/>
             <wp:cNvGraphicFramePr>
               <a:graphicFrameLocks noChangeAspect="1"/>
@@ -6041,7 +6393,7 @@
               <a:graphicData uri="http://schemas.openxmlformats.org/drawingml/2006/picture">
                 <pic:pic>
                   <pic:nvPicPr>
-                    <pic:cNvPr id="0" name="fig4-doc.png"/>
+                    <pic:cNvPr id="0" name="05_contrato_CT-0012.png"/>
                     <pic:cNvPicPr/>
                   </pic:nvPicPr>
                   <pic:blipFill>
@@ -6053,7 +6405,7 @@
                   <pic:spPr>
                     <a:xfrm>
                       <a:off x="0" y="0"/>
-                      <a:ext cx="5580000" cy="2130545"/>
+                      <a:ext cx="5580000" cy="3676428"/>
                     </a:xfrm>
                     <a:prstGeom prst="rect"/>
                   </pic:spPr>
@@ -6083,7 +6435,7 @@
       <w:r>
         <w:drawing>
           <wp:inline xmlns:a="http://schemas.openxmlformats.org/drawingml/2006/main" xmlns:pic="http://schemas.openxmlformats.org/drawingml/2006/picture">
-            <wp:extent cx="5580000" cy="2130545"/>
+            <wp:extent cx="5580000" cy="3676428"/>
             <wp:docPr id="5" name="Picture 5"/>
             <wp:cNvGraphicFramePr>
               <a:graphicFrameLocks noChangeAspect="1"/>
@@ -6092,7 +6444,7 @@
               <a:graphicData uri="http://schemas.openxmlformats.org/drawingml/2006/picture">
                 <pic:pic>
                   <pic:nvPicPr>
-                    <pic:cNvPr id="0" name="fig5-audit.png"/>
+                    <pic:cNvPr id="0" name="06_auditoria.png"/>
                     <pic:cNvPicPr/>
                   </pic:nvPicPr>
                   <pic:blipFill>
@@ -6104,7 +6456,7 @@
                   <pic:spPr>
                     <a:xfrm>
                       <a:off x="0" y="0"/>
-                      <a:ext cx="5580000" cy="2130545"/>
+                      <a:ext cx="5580000" cy="3676428"/>
                     </a:xfrm>
                     <a:prstGeom prst="rect"/>
                   </pic:spPr>
@@ -6128,6 +6480,210 @@
           <w:sz w:val="20"/>
         </w:rPr>
         <w:t>Figura 5. Auditoría de la corrida.</w:t>
+      </w:r>
+    </w:p>
+    <w:p>
+      <w:r>
+        <w:drawing>
+          <wp:inline xmlns:a="http://schemas.openxmlformats.org/drawingml/2006/main" xmlns:pic="http://schemas.openxmlformats.org/drawingml/2006/picture">
+            <wp:extent cx="5580000" cy="3186237"/>
+            <wp:docPr id="6" name="Picture 6"/>
+            <wp:cNvGraphicFramePr>
+              <a:graphicFrameLocks noChangeAspect="1"/>
+            </wp:cNvGraphicFramePr>
+            <a:graphic>
+              <a:graphicData uri="http://schemas.openxmlformats.org/drawingml/2006/picture">
+                <pic:pic>
+                  <pic:nvPicPr>
+                    <pic:cNvPr id="0" name="18_k6_200_usuarios.png"/>
+                    <pic:cNvPicPr/>
+                  </pic:nvPicPr>
+                  <pic:blipFill>
+                    <a:blip r:embed="rId15"/>
+                    <a:stretch>
+                      <a:fillRect/>
+                    </a:stretch>
+                  </pic:blipFill>
+                  <pic:spPr>
+                    <a:xfrm>
+                      <a:off x="0" y="0"/>
+                      <a:ext cx="5580000" cy="3186237"/>
+                    </a:xfrm>
+                    <a:prstGeom prst="rect"/>
+                  </pic:spPr>
+                </pic:pic>
+              </a:graphicData>
+            </a:graphic>
+          </wp:inline>
+        </w:drawing>
+      </w:r>
+    </w:p>
+    <w:p>
+      <w:pPr>
+        <w:spacing w:line="360" w:lineRule="auto" w:before="0" w:after="120"/>
+        <w:jc w:val="center"/>
+      </w:pPr>
+      <w:r>
+        <w:rPr>
+          <w:rFonts w:ascii="Arial" w:hAnsi="Arial" w:eastAsia="Arial"/>
+          <w:b w:val="0"/>
+          <w:color w:val="646B73"/>
+          <w:sz w:val="20"/>
+        </w:rPr>
+        <w:t>Figura 6. k6: 200 usuarios, p95 de 1,28 s.</w:t>
+      </w:r>
+    </w:p>
+    <w:p>
+      <w:r>
+        <w:drawing>
+          <wp:inline xmlns:a="http://schemas.openxmlformats.org/drawingml/2006/main" xmlns:pic="http://schemas.openxmlformats.org/drawingml/2006/picture">
+            <wp:extent cx="5580000" cy="3186237"/>
+            <wp:docPr id="7" name="Picture 7"/>
+            <wp:cNvGraphicFramePr>
+              <a:graphicFrameLocks noChangeAspect="1"/>
+            </wp:cNvGraphicFramePr>
+            <a:graphic>
+              <a:graphicData uri="http://schemas.openxmlformats.org/drawingml/2006/picture">
+                <pic:pic>
+                  <pic:nvPicPr>
+                    <pic:cNvPr id="0" name="15_npm_audit.png"/>
+                    <pic:cNvPicPr/>
+                  </pic:nvPicPr>
+                  <pic:blipFill>
+                    <a:blip r:embed="rId16"/>
+                    <a:stretch>
+                      <a:fillRect/>
+                    </a:stretch>
+                  </pic:blipFill>
+                  <pic:spPr>
+                    <a:xfrm>
+                      <a:off x="0" y="0"/>
+                      <a:ext cx="5580000" cy="3186237"/>
+                    </a:xfrm>
+                    <a:prstGeom prst="rect"/>
+                  </pic:spPr>
+                </pic:pic>
+              </a:graphicData>
+            </a:graphic>
+          </wp:inline>
+        </w:drawing>
+      </w:r>
+    </w:p>
+    <w:p>
+      <w:pPr>
+        <w:spacing w:line="360" w:lineRule="auto" w:before="0" w:after="120"/>
+        <w:jc w:val="center"/>
+      </w:pPr>
+      <w:r>
+        <w:rPr>
+          <w:rFonts w:ascii="Arial" w:hAnsi="Arial" w:eastAsia="Arial"/>
+          <w:b w:val="0"/>
+          <w:color w:val="646B73"/>
+          <w:sz w:val="20"/>
+        </w:rPr>
+        <w:t>Figura 7. npm audit de la API.</w:t>
+      </w:r>
+    </w:p>
+    <w:p>
+      <w:r>
+        <w:drawing>
+          <wp:inline xmlns:a="http://schemas.openxmlformats.org/drawingml/2006/main" xmlns:pic="http://schemas.openxmlformats.org/drawingml/2006/picture">
+            <wp:extent cx="5580000" cy="3186237"/>
+            <wp:docPr id="8" name="Picture 8"/>
+            <wp:cNvGraphicFramePr>
+              <a:graphicFrameLocks noChangeAspect="1"/>
+            </wp:cNvGraphicFramePr>
+            <a:graphic>
+              <a:graphicData uri="http://schemas.openxmlformats.org/drawingml/2006/picture">
+                <pic:pic>
+                  <pic:nvPicPr>
+                    <pic:cNvPr id="0" name="16_trivy.png"/>
+                    <pic:cNvPicPr/>
+                  </pic:nvPicPr>
+                  <pic:blipFill>
+                    <a:blip r:embed="rId17"/>
+                    <a:stretch>
+                      <a:fillRect/>
+                    </a:stretch>
+                  </pic:blipFill>
+                  <pic:spPr>
+                    <a:xfrm>
+                      <a:off x="0" y="0"/>
+                      <a:ext cx="5580000" cy="3186237"/>
+                    </a:xfrm>
+                    <a:prstGeom prst="rect"/>
+                  </pic:spPr>
+                </pic:pic>
+              </a:graphicData>
+            </a:graphic>
+          </wp:inline>
+        </w:drawing>
+      </w:r>
+    </w:p>
+    <w:p>
+      <w:pPr>
+        <w:spacing w:line="360" w:lineRule="auto" w:before="0" w:after="120"/>
+        <w:jc w:val="center"/>
+      </w:pPr>
+      <w:r>
+        <w:rPr>
+          <w:rFonts w:ascii="Arial" w:hAnsi="Arial" w:eastAsia="Arial"/>
+          <w:b w:val="0"/>
+          <w:color w:val="646B73"/>
+          <w:sz w:val="20"/>
+        </w:rPr>
+        <w:t>Figura 8. Trivy sobre la imagen atlas-api.</w:t>
+      </w:r>
+    </w:p>
+    <w:p>
+      <w:r>
+        <w:drawing>
+          <wp:inline xmlns:a="http://schemas.openxmlformats.org/drawingml/2006/main" xmlns:pic="http://schemas.openxmlformats.org/drawingml/2006/picture">
+            <wp:extent cx="5580000" cy="3186237"/>
+            <wp:docPr id="9" name="Picture 9"/>
+            <wp:cNvGraphicFramePr>
+              <a:graphicFrameLocks noChangeAspect="1"/>
+            </wp:cNvGraphicFramePr>
+            <a:graphic>
+              <a:graphicData uri="http://schemas.openxmlformats.org/drawingml/2006/picture">
+                <pic:pic>
+                  <pic:nvPicPr>
+                    <pic:cNvPr id="0" name="17_zap.png"/>
+                    <pic:cNvPicPr/>
+                  </pic:nvPicPr>
+                  <pic:blipFill>
+                    <a:blip r:embed="rId18"/>
+                    <a:stretch>
+                      <a:fillRect/>
+                    </a:stretch>
+                  </pic:blipFill>
+                  <pic:spPr>
+                    <a:xfrm>
+                      <a:off x="0" y="0"/>
+                      <a:ext cx="5580000" cy="3186237"/>
+                    </a:xfrm>
+                    <a:prstGeom prst="rect"/>
+                  </pic:spPr>
+                </pic:pic>
+              </a:graphicData>
+            </a:graphic>
+          </wp:inline>
+        </w:drawing>
+      </w:r>
+    </w:p>
+    <w:p>
+      <w:pPr>
+        <w:spacing w:line="360" w:lineRule="auto" w:before="0" w:after="120"/>
+        <w:jc w:val="center"/>
+      </w:pPr>
+      <w:r>
+        <w:rPr>
+          <w:rFonts w:ascii="Arial" w:hAnsi="Arial" w:eastAsia="Arial"/>
+          <w:b w:val="0"/>
+          <w:color w:val="646B73"/>
+          <w:sz w:val="20"/>
+        </w:rPr>
+        <w:t>Figura 9. OWASP ZAP sobre la pantalla.</w:t>
       </w:r>
     </w:p>
     <w:p>
@@ -6342,7 +6898,7 @@
                 <w:b w:val="0"/>
                 <w:sz w:val="18"/>
               </w:rPr>
-              <w:t>No se ejecutó la carga de 200 usuarios ni el p95 de 300 ms.</w:t>
+              <w:t>200 usuarios y 0 % de error, pero el p95 fue 1,28 s. El ERS pide menos de 300 ms.</w:t>
             </w:r>
           </w:p>
         </w:tc>
@@ -6475,6 +7031,138 @@
                 <w:sz w:val="18"/>
               </w:rPr>
               <w:t>El ERS supone correo de verificación y no está implementado.</w:t>
+            </w:r>
+          </w:p>
+        </w:tc>
+        <w:tc>
+          <w:tcPr>
+            <w:tcW w:type="dxa" w:w="2436"/>
+          </w:tcPr>
+          <w:p>
+            <w:r/>
+            <w:r>
+              <w:rPr>
+                <w:rFonts w:ascii="Arial" w:hAnsi="Arial" w:eastAsia="Arial"/>
+                <w:b w:val="0"/>
+                <w:sz w:val="18"/>
+              </w:rPr>
+              <w:t>Abierto</w:t>
+            </w:r>
+          </w:p>
+        </w:tc>
+      </w:tr>
+      <w:tr>
+        <w:tc>
+          <w:tcPr>
+            <w:tcW w:type="dxa" w:w="2436"/>
+          </w:tcPr>
+          <w:p>
+            <w:r/>
+            <w:r>
+              <w:rPr>
+                <w:rFonts w:ascii="Arial" w:hAnsi="Arial" w:eastAsia="Arial"/>
+                <w:b w:val="0"/>
+                <w:sz w:val="18"/>
+              </w:rPr>
+              <w:t>INC-05</w:t>
+            </w:r>
+          </w:p>
+        </w:tc>
+        <w:tc>
+          <w:tcPr>
+            <w:tcW w:type="dxa" w:w="2436"/>
+          </w:tcPr>
+          <w:p>
+            <w:r/>
+            <w:r>
+              <w:rPr>
+                <w:rFonts w:ascii="Arial" w:hAnsi="Arial" w:eastAsia="Arial"/>
+                <w:b w:val="0"/>
+                <w:sz w:val="18"/>
+              </w:rPr>
+              <w:t>Grave</w:t>
+            </w:r>
+          </w:p>
+        </w:tc>
+        <w:tc>
+          <w:tcPr>
+            <w:tcW w:type="dxa" w:w="2436"/>
+          </w:tcPr>
+          <w:p>
+            <w:r/>
+            <w:r>
+              <w:rPr>
+                <w:rFonts w:ascii="Arial" w:hAnsi="Arial" w:eastAsia="Arial"/>
+                <w:b w:val="0"/>
+                <w:sz w:val="18"/>
+              </w:rPr>
+              <w:t>npm audit y Trivy muestran vulnerabilidades altas en Express y en paquetes Node de la imagen. El parche de npm sube Express a 4.22.3, fuera de la versión fijada.</w:t>
+            </w:r>
+          </w:p>
+        </w:tc>
+        <w:tc>
+          <w:tcPr>
+            <w:tcW w:type="dxa" w:w="2436"/>
+          </w:tcPr>
+          <w:p>
+            <w:r/>
+            <w:r>
+              <w:rPr>
+                <w:rFonts w:ascii="Arial" w:hAnsi="Arial" w:eastAsia="Arial"/>
+                <w:b w:val="0"/>
+                <w:sz w:val="18"/>
+              </w:rPr>
+              <w:t>Abierto</w:t>
+            </w:r>
+          </w:p>
+        </w:tc>
+      </w:tr>
+      <w:tr>
+        <w:tc>
+          <w:tcPr>
+            <w:tcW w:type="dxa" w:w="2436"/>
+          </w:tcPr>
+          <w:p>
+            <w:r/>
+            <w:r>
+              <w:rPr>
+                <w:rFonts w:ascii="Arial" w:hAnsi="Arial" w:eastAsia="Arial"/>
+                <w:b w:val="0"/>
+                <w:sz w:val="18"/>
+              </w:rPr>
+              <w:t>INC-06</w:t>
+            </w:r>
+          </w:p>
+        </w:tc>
+        <w:tc>
+          <w:tcPr>
+            <w:tcW w:type="dxa" w:w="2436"/>
+          </w:tcPr>
+          <w:p>
+            <w:r/>
+            <w:r>
+              <w:rPr>
+                <w:rFonts w:ascii="Arial" w:hAnsi="Arial" w:eastAsia="Arial"/>
+                <w:b w:val="0"/>
+                <w:sz w:val="18"/>
+              </w:rPr>
+              <w:t>Moderado</w:t>
+            </w:r>
+          </w:p>
+        </w:tc>
+        <w:tc>
+          <w:tcPr>
+            <w:tcW w:type="dxa" w:w="2436"/>
+          </w:tcPr>
+          <w:p>
+            <w:r/>
+            <w:r>
+              <w:rPr>
+                <w:rFonts w:ascii="Arial" w:hAnsi="Arial" w:eastAsia="Arial"/>
+                <w:b w:val="0"/>
+                <w:sz w:val="18"/>
+              </w:rPr>
+              <w:t>ZAP no marcó fallos. La pantalla de nginx no envía X-Frame-Options, X-Content-Type-Options ni Content-Security-Policy. La API sí envía cabeceras más estrictas.</w:t>
             </w:r>
           </w:p>
         </w:tc>
@@ -6538,7 +7226,7 @@
           <w:b w:val="0"/>
           <w:sz w:val="22"/>
         </w:rPr>
-        <w:t>Los usuarios y el cliente Distribuidora Andina SpA son datos de prueba. Se informa el 403 y también lo que no se midió: carga, disponibilidad y TLS. Los hallazgos se usan para la evaluación y no para atacar otro sistema. La contraseña de prueba solo vale en este Docker local.</w:t>
+        <w:t>Los usuarios y el cliente Distribuidora Andina SpA son datos de prueba. Se informa el 403, el p95 de 1,28 s y los hallazgos de npm audit, Trivy y ZAP. No se declara disponibilidad mensual ni TLS de un servidor real. Los escaneos se hicieron solo contra este Docker local. La contraseña de prueba solo vale aquí.</w:t>
       </w:r>
     </w:p>
     <w:p>
@@ -6886,7 +7574,7 @@
                 <w:b w:val="0"/>
                 <w:sz w:val="18"/>
               </w:rPr>
-              <w:t>Correr la carga de 200 usuarios sobre el listado de clientes y registrar p95</w:t>
+              <w:t>Bajar el p95 del listado de clientes bajo 300 ms y volver a medir con k6</w:t>
             </w:r>
           </w:p>
         </w:tc>
@@ -6970,7 +7658,7 @@
                 <w:b w:val="0"/>
                 <w:sz w:val="18"/>
               </w:rPr>
-              <w:t>Media</w:t>
+              <w:t>Alta</w:t>
             </w:r>
           </w:p>
         </w:tc>
@@ -6986,7 +7674,7 @@
                 <w:b w:val="0"/>
                 <w:sz w:val="18"/>
               </w:rPr>
-              <w:t>Agregar el correo de verificación que el ERS supone</w:t>
+              <w:t>Planificar el parche de Express y body-parser, y justificar el cambio respecto de la versión 4.19.2 del ERS</w:t>
             </w:r>
           </w:p>
         </w:tc>
@@ -7002,7 +7690,7 @@
                 <w:b w:val="0"/>
                 <w:sz w:val="18"/>
               </w:rPr>
-              <w:t>INC-04</w:t>
+              <w:t>INC-05</w:t>
             </w:r>
           </w:p>
         </w:tc>
@@ -7036,7 +7724,7 @@
                 <w:b w:val="0"/>
                 <w:sz w:val="18"/>
               </w:rPr>
-              <w:t>Ejecutar npm audit y Trivy sobre la imagen y anexar el reporte</w:t>
+              <w:t>Enviar en nginx las cabeceras que ZAP marcó en la pantalla</w:t>
             </w:r>
           </w:p>
         </w:tc>
@@ -7052,7 +7740,57 @@
                 <w:b w:val="0"/>
                 <w:sz w:val="18"/>
               </w:rPr>
-              <w:t>AST-05</w:t>
+              <w:t>INC-06</w:t>
+            </w:r>
+          </w:p>
+        </w:tc>
+      </w:tr>
+      <w:tr>
+        <w:tc>
+          <w:tcPr>
+            <w:tcW w:type="dxa" w:w="3249"/>
+          </w:tcPr>
+          <w:p>
+            <w:r/>
+            <w:r>
+              <w:rPr>
+                <w:rFonts w:ascii="Arial" w:hAnsi="Arial" w:eastAsia="Arial"/>
+                <w:b w:val="0"/>
+                <w:sz w:val="18"/>
+              </w:rPr>
+              <w:t>Media</w:t>
+            </w:r>
+          </w:p>
+        </w:tc>
+        <w:tc>
+          <w:tcPr>
+            <w:tcW w:type="dxa" w:w="3249"/>
+          </w:tcPr>
+          <w:p>
+            <w:r/>
+            <w:r>
+              <w:rPr>
+                <w:rFonts w:ascii="Arial" w:hAnsi="Arial" w:eastAsia="Arial"/>
+                <w:b w:val="0"/>
+                <w:sz w:val="18"/>
+              </w:rPr>
+              <w:t>Agregar el correo de verificación que el ERS supone</w:t>
+            </w:r>
+          </w:p>
+        </w:tc>
+        <w:tc>
+          <w:tcPr>
+            <w:tcW w:type="dxa" w:w="3249"/>
+          </w:tcPr>
+          <w:p>
+            <w:r/>
+            <w:r>
+              <w:rPr>
+                <w:rFonts w:ascii="Arial" w:hAnsi="Arial" w:eastAsia="Arial"/>
+                <w:b w:val="0"/>
+                <w:sz w:val="18"/>
+              </w:rPr>
+              <w:t>INC-04</w:t>
             </w:r>
           </w:p>
         </w:tc>
@@ -7149,7 +7887,7 @@
           <w:b w:val="0"/>
           <w:sz w:val="22"/>
         </w:rPr>
-        <w:t>No está acreditado el rendimiento de 200 usuarios ni el TLS de un despliegue real. El veredicto es de avance con riesgo controlado en el ambiente de prueba, y con INC-02 e INC-03 abiertos antes de producción.</w:t>
+        <w:t>La carga sí se midió: 200 usuarios, 4428 peticiones y 0 % de error, con p95 de 1,28 s. Ese tiempo no acredita NFR-PERF-1. Tampoco están cerrados el TLS, las vulnerabilidades altas de dependencias ni las cabeceras de la pantalla. El veredicto es de avance en ambiente de prueba, con INC-02, INC-03 e INC-05 abiertos antes de producción.</w:t>
       </w:r>
     </w:p>
     <w:p>
@@ -7207,6 +7945,62 @@
           <w:sz w:val="22"/>
         </w:rPr>
         <w:t>C. Código y arranque: codigo/atlas y docker compose up -d --build.</w:t>
+      </w:r>
+    </w:p>
+    <w:p>
+      <w:pPr>
+        <w:spacing w:line="360" w:lineRule="auto" w:before="0" w:after="120"/>
+        <w:jc w:val="both"/>
+      </w:pPr>
+      <w:r>
+        <w:rPr>
+          <w:rFonts w:ascii="Arial" w:hAnsi="Arial" w:eastAsia="Arial"/>
+          <w:b w:val="0"/>
+          <w:sz w:val="22"/>
+        </w:rPr>
+        <w:t>D. Carga k6: evidencias/atlas/otras/k6-carga.txt y codigo/atlas/pruebas/carga.js.</w:t>
+      </w:r>
+    </w:p>
+    <w:p>
+      <w:pPr>
+        <w:spacing w:line="360" w:lineRule="auto" w:before="0" w:after="120"/>
+        <w:jc w:val="both"/>
+      </w:pPr>
+      <w:r>
+        <w:rPr>
+          <w:rFonts w:ascii="Arial" w:hAnsi="Arial" w:eastAsia="Arial"/>
+          <w:b w:val="0"/>
+          <w:sz w:val="22"/>
+        </w:rPr>
+        <w:t>E. npm audit: evidencias/atlas/otras/npm-audit-api.txt.</w:t>
+      </w:r>
+    </w:p>
+    <w:p>
+      <w:pPr>
+        <w:spacing w:line="360" w:lineRule="auto" w:before="0" w:after="120"/>
+        <w:jc w:val="both"/>
+      </w:pPr>
+      <w:r>
+        <w:rPr>
+          <w:rFonts w:ascii="Arial" w:hAnsi="Arial" w:eastAsia="Arial"/>
+          <w:b w:val="0"/>
+          <w:sz w:val="22"/>
+        </w:rPr>
+        <w:t>F. Trivy: evidencias/atlas/otras/trivy-api.txt.</w:t>
+      </w:r>
+    </w:p>
+    <w:p>
+      <w:pPr>
+        <w:spacing w:line="360" w:lineRule="auto" w:before="0" w:after="120"/>
+        <w:jc w:val="both"/>
+      </w:pPr>
+      <w:r>
+        <w:rPr>
+          <w:rFonts w:ascii="Arial" w:hAnsi="Arial" w:eastAsia="Arial"/>
+          <w:b w:val="0"/>
+          <w:sz w:val="22"/>
+        </w:rPr>
+        <w:t>G. OWASP ZAP: evidencias/atlas/otras/zap-pantalla.html.</w:t>
       </w:r>
     </w:p>
     <w:sectPr>

</xml_diff>